<commit_message>
DD-85 ETL 节点上的 Airflow 双活；LD-08 新增 3.3；资源表与 CLAUDE.md 同步
ETL-1、ETL-2 两台都运行 Airflow 全部组件（LocalExecutor），scheduler 不保存
状态，靠元数据库行锁协调，同一任务不会被两边同时执行；一台失效，其任务心跳
超时后由另一台重跑。

对任务的三条要求：能重跑；不依赖在哪台机器上运行（只经数据库或对象存储交接，
不经本地文件——单机开发环境里永远暴露不出来）；并发受限者用 pool。pool 是
元数据库中的一行，整个集群共用，不是每台各一：icp_cms、dbt_build 各 1 槽。
pool 只管经 Airflow 启动的任务，手工补数会绕过它，故接入程序另按源持有
PostgreSQL 咨询锁（经会话池，DD-67）。

被拒绝：CeleryExecutor（多一个须高可用的消息中间件）、主备加 VIP（自建切换、
双主风险）、只靠 pool（挡不住手工执行）。

资源表 ETL-1..2 的备注写明运行 Airflow（含组件与双活）、dbt 与接入作业；
CLAUDE.md 硬约束由五条增为七条。

Co-Authored-By: Claude Opus 5.5 <noreply@anthropic.com>
Claude-Session: https://claude.ai/code/session_01MzPePSHWkTUSpnMTsqY5pZ
</commit_message>
<xml_diff>
--- a/LD-08_高可用与部署详细设计.docx
+++ b/LD-08_高可用与部署详细设计.docx
@@ -222,6 +222,260 @@
       <w:pPr/>
       <w:r>
         <w:t>最后一条值得展开。分析副本上长事务的后果不是「那个查询慢」，而是主库的清理被阻塞、WAL 累积、磁盘增长——一个用户的疏忽通过复制链路影响到写入侧。硬超时是唯一可靠的防线，靠规范和培训不行。</w:t>
+      </w:r>
+    </w:p>
+    <w:p>
+      <w:pPr>
+        <w:pStyle w:val="Heading2"/>
+      </w:pPr>
+      <w:r>
+        <w:t>3.3  ETL 节点：Airflow 双活</w:t>
+      </w:r>
+    </w:p>
+    <w:p>
+      <w:pPr>
+        <w:spacing w:before="0" w:after="1000"/>
+        <w:jc w:val="center"/>
+      </w:pPr>
+      <w:r>
+        <w:rPr>
+          <w:rFonts w:ascii="微软雅黑" w:hAnsi="微软雅黑" w:eastAsia="微软雅黑"/>
+          <w:b w:val="0"/>
+          <w:color w:val="4B5563"/>
+          <w:sz w:val="23"/>
+        </w:rPr>
+        <w:t>Airflow、dbt 与接入程序运行在 ETL-1、ETL-2 两台虚机上（DD-85）。两台都运行 Airflow 的全部组件——api-server、scheduler、dag-processor、triggerer——执行器为 LocalExecutor，元数据库置于 PostgreSQL 高可用集群中的独立数据库（DD-44）。两台同时工作，不分主备。</w:t>
+      </w:r>
+    </w:p>
+    <w:p>
+      <w:pPr>
+        <w:spacing w:before="0" w:after="1000"/>
+        <w:jc w:val="center"/>
+      </w:pPr>
+      <w:r>
+        <w:rPr>
+          <w:rFonts w:ascii="微软雅黑" w:hAnsi="微软雅黑" w:eastAsia="微软雅黑"/>
+          <w:b w:val="0"/>
+          <w:color w:val="4B5563"/>
+          <w:sz w:val="23"/>
+        </w:rPr>
+        <w:t>双活靠的是 scheduler 本身不保存状态：任务的依赖关系、每个任务实例的状态、pool 的占用全部在元数据库里。两个 scheduler 各自循环，每一轮查询「依赖已满足、可以运行」的任务，以数据库行锁锁住选中的任务实例后再启动，另一个 scheduler 遇到锁即跳过——同一任务不会被两边同时执行，谁锁到就在谁的机器上运行。接入程序与 dbt 作为子进程，在锁到任务的那台机器上运行。任务之间的依赖照常生效：上游未完成，下游不会进入可运行的名单，无论由哪个 scheduler 判断，结论相同。</w:t>
+      </w:r>
+    </w:p>
+    <w:p>
+      <w:pPr>
+        <w:spacing w:before="0" w:after="1000"/>
+        <w:jc w:val="center"/>
+      </w:pPr>
+      <w:r>
+        <w:rPr>
+          <w:rFonts w:ascii="微软雅黑" w:hAnsi="微软雅黑" w:eastAsia="微软雅黑"/>
+          <w:b w:val="0"/>
+          <w:color w:val="4B5563"/>
+          <w:sz w:val="23"/>
+        </w:rPr>
+        <w:t>一台机器失效时，它正在运行的任务失去心跳，超时后被标为失败，按重试次数由另一台重跑。这对任务提出三条要求，缺一条双活就不成立：</w:t>
+      </w:r>
+    </w:p>
+    <w:tbl>
+      <w:tblPr>
+        <w:tblW w:type="auto" w:w="0"/>
+        <w:jc w:val="center"/>
+        <w:tblLayout w:type="fixed"/>
+        <w:tblLook w:firstColumn="1" w:firstRow="1" w:lastColumn="0" w:lastRow="0" w:noHBand="0" w:noVBand="1" w:val="04A0"/>
+        <w:tblLayout w:type="fixed"/>
+        <w:tblBorders>
+          <w:top w:val="single" w:sz="4" w:space="0" w:color="BFC7D2"/>
+          <w:left w:val="single" w:sz="4" w:space="0" w:color="BFC7D2"/>
+          <w:bottom w:val="single" w:sz="4" w:space="0" w:color="BFC7D2"/>
+          <w:right w:val="single" w:sz="4" w:space="0" w:color="BFC7D2"/>
+          <w:insideH w:val="single" w:sz="4" w:space="0" w:color="BFC7D2"/>
+          <w:insideV w:val="single" w:sz="4" w:space="0" w:color="BFC7D2"/>
+        </w:tblBorders>
+      </w:tblPr>
+      <w:tblGrid>
+        <w:gridCol w:w="3969"/>
+        <w:gridCol w:w="4989"/>
+      </w:tblGrid>
+      <w:tr>
+        <w:trPr>
+          <w:tblHeader/>
+        </w:trPr>
+        <w:tc>
+          <w:tcPr>
+            <w:tcW w:type="dxa" w:w="3969"/>
+            <w:shd w:val="clear" w:fill="EEF2FD"/>
+          </w:tcPr>
+          <w:p>
+            <w:pPr>
+              <w:spacing w:after="40" w:before="40"/>
+            </w:pPr>
+            <w:r>
+              <w:t>要求</w:t>
+            </w:r>
+          </w:p>
+        </w:tc>
+        <w:tc>
+          <w:tcPr>
+            <w:tcW w:type="dxa" w:w="4989"/>
+            <w:shd w:val="clear" w:fill="EEF2FD"/>
+          </w:tcPr>
+          <w:p>
+            <w:pPr>
+              <w:spacing w:after="40" w:before="40"/>
+            </w:pPr>
+            <w:r>
+              <w:t>说明</w:t>
+            </w:r>
+          </w:p>
+        </w:tc>
+      </w:tr>
+      <w:tr>
+        <w:trPr>
+          <w:tblHeader/>
+        </w:trPr>
+        <w:tc>
+          <w:tcPr>
+            <w:tcW w:type="dxa" w:w="3969"/>
+            <w:shd w:val="clear" w:fill="EEF2FD"/>
+          </w:tcPr>
+          <w:p>
+            <w:pPr>
+              <w:spacing w:after="40" w:before="40"/>
+            </w:pPr>
+            <w:r>
+              <w:rPr>
+                <w:b w:val="0"/>
+              </w:rPr>
+              <w:t>一、能重跑</w:t>
+            </w:r>
+          </w:p>
+        </w:tc>
+        <w:tc>
+          <w:tcPr>
+            <w:tcW w:type="dxa" w:w="4989"/>
+            <w:shd w:val="clear" w:fill="EEF2FD"/>
+          </w:tcPr>
+          <w:p>
+            <w:pPr>
+              <w:spacing w:after="40" w:before="40"/>
+            </w:pPr>
+            <w:r>
+              <w:rPr>
+                <w:b w:val="0"/>
+              </w:rPr>
+              <w:t>失败不推进水位，写 raw 按内容去重（LD-01 · DD-82），重跑最多白跑一次，不产生重复数据。</w:t>
+            </w:r>
+          </w:p>
+        </w:tc>
+      </w:tr>
+      <w:tr>
+        <w:trPr>
+          <w:tblHeader/>
+        </w:trPr>
+        <w:tc>
+          <w:tcPr>
+            <w:tcW w:type="dxa" w:w="3969"/>
+            <w:shd w:val="clear" w:fill="EEF2FD"/>
+          </w:tcPr>
+          <w:p>
+            <w:pPr>
+              <w:spacing w:after="40" w:before="40"/>
+            </w:pPr>
+            <w:r>
+              <w:rPr>
+                <w:b w:val="0"/>
+              </w:rPr>
+              <w:t>二、不依赖在哪台机器上运行</w:t>
+            </w:r>
+          </w:p>
+        </w:tc>
+        <w:tc>
+          <w:tcPr>
+            <w:tcW w:type="dxa" w:w="4989"/>
+            <w:shd w:val="clear" w:fill="EEF2FD"/>
+          </w:tcPr>
+          <w:p>
+            <w:pPr>
+              <w:spacing w:after="40" w:before="40"/>
+            </w:pPr>
+            <w:r>
+              <w:rPr>
+                <w:b w:val="0"/>
+              </w:rPr>
+              <w:t>任务之间只经数据库或对象存储交接，不经本地文件。取数任务若把文件存在 ETL-1 的本地磁盘，下一个任务被 ETL-2 锁到时就读不到。这类错误是间歇性的——取决于两个任务碰巧是否落在同一台上——且在单机的开发环境中永远不会出现。</w:t>
+            </w:r>
+          </w:p>
+        </w:tc>
+      </w:tr>
+      <w:tr>
+        <w:trPr>
+          <w:tblHeader/>
+        </w:trPr>
+        <w:tc>
+          <w:tcPr>
+            <w:tcW w:type="dxa" w:w="3969"/>
+            <w:shd w:val="clear" w:fill="EEF2FD"/>
+          </w:tcPr>
+          <w:p>
+            <w:pPr>
+              <w:spacing w:after="40" w:before="40"/>
+            </w:pPr>
+            <w:r>
+              <w:rPr>
+                <w:b w:val="0"/>
+              </w:rPr>
+              <w:t>三、有并发限制的用 pool 约束</w:t>
+            </w:r>
+          </w:p>
+        </w:tc>
+        <w:tc>
+          <w:tcPr>
+            <w:tcW w:type="dxa" w:w="4989"/>
+            <w:shd w:val="clear" w:fill="EEF2FD"/>
+          </w:tcPr>
+          <w:p>
+            <w:pPr>
+              <w:spacing w:after="40" w:before="40"/>
+            </w:pPr>
+            <w:r>
+              <w:rPr>
+                <w:b w:val="0"/>
+              </w:rPr>
+              <w:t>pool 是元数据库中的一行，整个集群共用，不是每台机器各一个。scheduler 启动任务前在同一事务中锁住 pool 行、核对占用，有空位才启动；另一个 scheduler 须等锁释放，再看时已无空位。ICP 话单下载一个 pool（icp_cms），dbt 构建一个 pool（dbt_build），各 1 个槽位：前者因 ICP 接口不支持并发下载，后者因两台同时运行 dbt 会使线程总数超过 pgBouncer 会话池而卡住不报错（DD-67）。</w:t>
+            </w:r>
+          </w:p>
+        </w:tc>
+      </w:tr>
+    </w:tbl>
+    <w:p>
+      <w:pPr>
+        <w:spacing w:before="0" w:after="1000"/>
+        <w:jc w:val="center"/>
+      </w:pPr>
+      <w:r>
+        <w:rPr>
+          <w:rFonts w:ascii="微软雅黑" w:hAnsi="微软雅黑" w:eastAsia="微软雅黑"/>
+          <w:b w:val="0"/>
+          <w:color w:val="4B5563"/>
+          <w:sz w:val="23"/>
+        </w:rPr>
+        <w:t>pool 只约束经 Airflow 启动的任务。接入程序可以手工执行以补数（LD-01 2.5），手工的那一次绕过 pool。因此接入程序自身在运行期间按源持有一把 PostgreSQL 咨询锁，拿不到即以退出码 1 退出——无论由 Airflow 还是由人启动，同一源同一时刻只有一个实例在取数。该锁须经 pgBouncer 的会话池，事务池会使咨询锁随机失效（DD-67）。</w:t>
+      </w:r>
+    </w:p>
+    <w:p>
+      <w:pPr>
+        <w:spacing w:before="0" w:after="1000"/>
+        <w:jc w:val="center"/>
+      </w:pPr>
+      <w:r>
+        <w:rPr>
+          <w:rFonts w:ascii="微软雅黑" w:hAnsi="微软雅黑" w:eastAsia="微软雅黑"/>
+          <w:b w:val="0"/>
+          <w:color w:val="4B5563"/>
+          <w:sz w:val="23"/>
+        </w:rPr>
+        <w:t>两台的 venv、DAG 文件与凭据文件必须一致，由同一套剧本部署；开发环境为单台，上述第二条与 pool 的约束只有在双活下才会被真正检验，测试环境须安排一次双节点验证。</w:t>
       </w:r>
     </w:p>
     <w:p>

</xml_diff>